<commit_message>
feat: Add Tariff tests and pages
</commit_message>
<xml_diff>
--- a/BO/Tariff Test.docx
+++ b/BO/Tariff Test.docx
@@ -278,6 +278,296 @@
       </w:pPr>
       <w:r>
         <w:t xml:space="preserve">Assess how the link responds to various screen sizes and orientations, particularly when resizing the browser window or rotating a mobile device.  </w:t>
+      </w:r>
+    </w:p>
+    <w:p/>
+    <w:p/>
+    <w:p/>
+    <w:p>
+      <w:pPr>
+        <w:rPr>
+          <w:b/>
+          <w:bCs/>
+        </w:rPr>
+      </w:pPr>
+      <w:r>
+        <w:rPr>
+          <w:b/>
+          <w:bCs/>
+        </w:rPr>
+        <w:lastRenderedPageBreak/>
+        <w:t>Button</w:t>
+      </w:r>
+    </w:p>
+    <w:p>
+      <w:pPr>
+        <w:rPr>
+          <w:b/>
+          <w:bCs/>
+        </w:rPr>
+      </w:pPr>
+      <w:r>
+        <w:rPr>
+          <w:b/>
+          <w:bCs/>
+        </w:rPr>
+        <w:t>Positive Tests:</w:t>
+      </w:r>
+    </w:p>
+    <w:p>
+      <w:pPr>
+        <w:pStyle w:val="ListParagraph"/>
+        <w:numPr>
+          <w:ilvl w:val="0"/>
+          <w:numId w:val="4"/>
+        </w:numPr>
+      </w:pPr>
+      <w:r>
+        <w:t xml:space="preserve">Verify that clicking the button successfully triggers the intended action (e.g., opening a tariff details page).  </w:t>
+      </w:r>
+    </w:p>
+    <w:p>
+      <w:pPr>
+        <w:pStyle w:val="ListParagraph"/>
+        <w:numPr>
+          <w:ilvl w:val="0"/>
+          <w:numId w:val="4"/>
+        </w:numPr>
+      </w:pPr>
+      <w:r>
+        <w:t xml:space="preserve">Check that the button is visually distinct and recognizable as interactive to users.  </w:t>
+      </w:r>
+    </w:p>
+    <w:p>
+      <w:pPr>
+        <w:pStyle w:val="ListParagraph"/>
+        <w:numPr>
+          <w:ilvl w:val="0"/>
+          <w:numId w:val="4"/>
+        </w:numPr>
+      </w:pPr>
+      <w:r>
+        <w:t xml:space="preserve">Ensure that the button's label ("Tariff") is displayed correctly and is legible on all supported devices.  </w:t>
+      </w:r>
+    </w:p>
+    <w:p>
+      <w:pPr>
+        <w:pStyle w:val="ListParagraph"/>
+        <w:numPr>
+          <w:ilvl w:val="0"/>
+          <w:numId w:val="4"/>
+        </w:numPr>
+      </w:pPr>
+      <w:r>
+        <w:t xml:space="preserve">Test the button's hover state to confirm that it changes </w:t>
+      </w:r>
+      <w:proofErr w:type="spellStart"/>
+      <w:r>
+        <w:t>color</w:t>
+      </w:r>
+      <w:proofErr w:type="spellEnd"/>
+      <w:r>
+        <w:t xml:space="preserve"> as expected when the mouse hovers over it.  </w:t>
+      </w:r>
+    </w:p>
+    <w:p>
+      <w:pPr>
+        <w:pStyle w:val="ListParagraph"/>
+        <w:numPr>
+          <w:ilvl w:val="0"/>
+          <w:numId w:val="4"/>
+        </w:numPr>
+      </w:pPr>
+      <w:r>
+        <w:t xml:space="preserve">Validate that the button is accessible via keyboard navigation and can be activated using the Enter or Space key.  </w:t>
+      </w:r>
+    </w:p>
+    <w:p>
+      <w:pPr>
+        <w:pStyle w:val="ListParagraph"/>
+        <w:numPr>
+          <w:ilvl w:val="0"/>
+          <w:numId w:val="4"/>
+        </w:numPr>
+      </w:pPr>
+      <w:r>
+        <w:t xml:space="preserve">Confirm that the button is enabled and clickable when the application is in a normal state.  </w:t>
+      </w:r>
+    </w:p>
+    <w:p/>
+    <w:p>
+      <w:pPr>
+        <w:rPr>
+          <w:b/>
+          <w:bCs/>
+        </w:rPr>
+      </w:pPr>
+      <w:r>
+        <w:rPr>
+          <w:b/>
+          <w:bCs/>
+        </w:rPr>
+        <w:t>Negative Tests:</w:t>
+      </w:r>
+    </w:p>
+    <w:p>
+      <w:pPr>
+        <w:pStyle w:val="ListParagraph"/>
+        <w:numPr>
+          <w:ilvl w:val="0"/>
+          <w:numId w:val="5"/>
+        </w:numPr>
+      </w:pPr>
+      <w:r>
+        <w:t xml:space="preserve">Attempt to click the button when it is disabled (if applicable) and verify that no action is triggered.  </w:t>
+      </w:r>
+    </w:p>
+    <w:p>
+      <w:pPr>
+        <w:pStyle w:val="ListParagraph"/>
+        <w:numPr>
+          <w:ilvl w:val="0"/>
+          <w:numId w:val="5"/>
+        </w:numPr>
+      </w:pPr>
+      <w:r>
+        <w:t xml:space="preserve">Check that the button does not respond to clicks when the user is not authenticated (if the action requires authentication).  </w:t>
+      </w:r>
+    </w:p>
+    <w:p>
+      <w:pPr>
+        <w:pStyle w:val="ListParagraph"/>
+        <w:numPr>
+          <w:ilvl w:val="0"/>
+          <w:numId w:val="5"/>
+        </w:numPr>
+      </w:pPr>
+      <w:r>
+        <w:t xml:space="preserve">Verify that the button does not perform any action when clicked rapidly multiple times (simulating a </w:t>
+      </w:r>
+      <w:proofErr w:type="spellStart"/>
+      <w:r>
+        <w:t>doubleclick</w:t>
+      </w:r>
+      <w:proofErr w:type="spellEnd"/>
+      <w:r>
+        <w:t xml:space="preserve"> scenario).  </w:t>
+      </w:r>
+    </w:p>
+    <w:p>
+      <w:pPr>
+        <w:pStyle w:val="ListParagraph"/>
+        <w:numPr>
+          <w:ilvl w:val="0"/>
+          <w:numId w:val="5"/>
+        </w:numPr>
+      </w:pPr>
+      <w:r>
+        <w:t xml:space="preserve">Test clicking the button when the application is in a loading state to ensure it does not trigger multiple actions or errors.  </w:t>
+      </w:r>
+    </w:p>
+    <w:p>
+      <w:pPr>
+        <w:pStyle w:val="ListParagraph"/>
+        <w:numPr>
+          <w:ilvl w:val="0"/>
+          <w:numId w:val="5"/>
+        </w:numPr>
+      </w:pPr>
+      <w:r>
+        <w:t xml:space="preserve">Attempt to interact with the button while the page is being rendered or if there are JavaScript errors present.  </w:t>
+      </w:r>
+    </w:p>
+    <w:p/>
+    <w:p>
+      <w:pPr>
+        <w:rPr>
+          <w:b/>
+          <w:bCs/>
+        </w:rPr>
+      </w:pPr>
+      <w:r>
+        <w:rPr>
+          <w:b/>
+          <w:bCs/>
+        </w:rPr>
+        <w:t>Creative Test Scenarios:</w:t>
+      </w:r>
+    </w:p>
+    <w:p>
+      <w:pPr>
+        <w:pStyle w:val="ListParagraph"/>
+        <w:numPr>
+          <w:ilvl w:val="0"/>
+          <w:numId w:val="6"/>
+        </w:numPr>
+      </w:pPr>
+      <w:r>
+        <w:t xml:space="preserve">Simulate a user with visual impairments using a screen reader and verify that the button is properly announced and described.  </w:t>
+      </w:r>
+    </w:p>
+    <w:p>
+      <w:pPr>
+        <w:pStyle w:val="ListParagraph"/>
+        <w:numPr>
+          <w:ilvl w:val="0"/>
+          <w:numId w:val="6"/>
+        </w:numPr>
+      </w:pPr>
+      <w:r>
+        <w:t xml:space="preserve">Test the button's functionality on various devices and screen sizes to ensure it maintains usability across platforms (responsive design).  </w:t>
+      </w:r>
+    </w:p>
+    <w:p>
+      <w:pPr>
+        <w:pStyle w:val="ListParagraph"/>
+        <w:numPr>
+          <w:ilvl w:val="0"/>
+          <w:numId w:val="6"/>
+        </w:numPr>
+      </w:pPr>
+      <w:r>
+        <w:t xml:space="preserve">Explore the button's </w:t>
+      </w:r>
+      <w:proofErr w:type="spellStart"/>
+      <w:r>
+        <w:t>behavior</w:t>
+      </w:r>
+      <w:proofErr w:type="spellEnd"/>
+      <w:r>
+        <w:t xml:space="preserve"> in different themes (light/dark mode) to ensure proper </w:t>
+      </w:r>
+      <w:proofErr w:type="spellStart"/>
+      <w:r>
+        <w:t>color</w:t>
+      </w:r>
+      <w:proofErr w:type="spellEnd"/>
+      <w:r>
+        <w:t xml:space="preserve"> contrast and visibility.  </w:t>
+      </w:r>
+    </w:p>
+    <w:p>
+      <w:pPr>
+        <w:pStyle w:val="ListParagraph"/>
+        <w:numPr>
+          <w:ilvl w:val="0"/>
+          <w:numId w:val="6"/>
+        </w:numPr>
+      </w:pPr>
+      <w:r>
+        <w:t xml:space="preserve">Create a scenario where the button is clicked after a short delay (e.g., 5 seconds) to test if the button remains responsive after a timeout.  </w:t>
+      </w:r>
+    </w:p>
+    <w:p>
+      <w:pPr>
+        <w:pStyle w:val="ListParagraph"/>
+        <w:numPr>
+          <w:ilvl w:val="0"/>
+          <w:numId w:val="6"/>
+        </w:numPr>
+      </w:pPr>
+      <w:r>
+        <w:t xml:space="preserve">Investigate the button's performance under low network conditions to see if it still functions correctly without significant delays.  </w:t>
       </w:r>
     </w:p>
     <w:sectPr>
@@ -379,6 +669,92 @@
     </w:lvl>
   </w:abstractNum>
   <w:abstractNum w:abstractNumId="1" w15:restartNumberingAfterBreak="0">
+    <w:nsid w:val="30C944FD"/>
+    <w:multiLevelType w:val="hybridMultilevel"/>
+    <w:tmpl w:val="E5AC7E26"/>
+    <w:lvl w:ilvl="0" w:tplc="0C00000F">
+      <w:start w:val="1"/>
+      <w:numFmt w:val="decimal"/>
+      <w:lvlText w:val="%1."/>
+      <w:lvlJc w:val="left"/>
+      <w:pPr>
+        <w:ind w:left="720" w:hanging="360"/>
+      </w:pPr>
+    </w:lvl>
+    <w:lvl w:ilvl="1" w:tplc="0C000019" w:tentative="1">
+      <w:start w:val="1"/>
+      <w:numFmt w:val="lowerLetter"/>
+      <w:lvlText w:val="%2."/>
+      <w:lvlJc w:val="left"/>
+      <w:pPr>
+        <w:ind w:left="1440" w:hanging="360"/>
+      </w:pPr>
+    </w:lvl>
+    <w:lvl w:ilvl="2" w:tplc="0C00001B" w:tentative="1">
+      <w:start w:val="1"/>
+      <w:numFmt w:val="lowerRoman"/>
+      <w:lvlText w:val="%3."/>
+      <w:lvlJc w:val="right"/>
+      <w:pPr>
+        <w:ind w:left="2160" w:hanging="180"/>
+      </w:pPr>
+    </w:lvl>
+    <w:lvl w:ilvl="3" w:tplc="0C00000F" w:tentative="1">
+      <w:start w:val="1"/>
+      <w:numFmt w:val="decimal"/>
+      <w:lvlText w:val="%4."/>
+      <w:lvlJc w:val="left"/>
+      <w:pPr>
+        <w:ind w:left="2880" w:hanging="360"/>
+      </w:pPr>
+    </w:lvl>
+    <w:lvl w:ilvl="4" w:tplc="0C000019" w:tentative="1">
+      <w:start w:val="1"/>
+      <w:numFmt w:val="lowerLetter"/>
+      <w:lvlText w:val="%5."/>
+      <w:lvlJc w:val="left"/>
+      <w:pPr>
+        <w:ind w:left="3600" w:hanging="360"/>
+      </w:pPr>
+    </w:lvl>
+    <w:lvl w:ilvl="5" w:tplc="0C00001B" w:tentative="1">
+      <w:start w:val="1"/>
+      <w:numFmt w:val="lowerRoman"/>
+      <w:lvlText w:val="%6."/>
+      <w:lvlJc w:val="right"/>
+      <w:pPr>
+        <w:ind w:left="4320" w:hanging="180"/>
+      </w:pPr>
+    </w:lvl>
+    <w:lvl w:ilvl="6" w:tplc="0C00000F" w:tentative="1">
+      <w:start w:val="1"/>
+      <w:numFmt w:val="decimal"/>
+      <w:lvlText w:val="%7."/>
+      <w:lvlJc w:val="left"/>
+      <w:pPr>
+        <w:ind w:left="5040" w:hanging="360"/>
+      </w:pPr>
+    </w:lvl>
+    <w:lvl w:ilvl="7" w:tplc="0C000019" w:tentative="1">
+      <w:start w:val="1"/>
+      <w:numFmt w:val="lowerLetter"/>
+      <w:lvlText w:val="%8."/>
+      <w:lvlJc w:val="left"/>
+      <w:pPr>
+        <w:ind w:left="5760" w:hanging="360"/>
+      </w:pPr>
+    </w:lvl>
+    <w:lvl w:ilvl="8" w:tplc="0C00001B" w:tentative="1">
+      <w:start w:val="1"/>
+      <w:numFmt w:val="lowerRoman"/>
+      <w:lvlText w:val="%9."/>
+      <w:lvlJc w:val="right"/>
+      <w:pPr>
+        <w:ind w:left="6480" w:hanging="180"/>
+      </w:pPr>
+    </w:lvl>
+  </w:abstractNum>
+  <w:abstractNum w:abstractNumId="2" w15:restartNumberingAfterBreak="0">
     <w:nsid w:val="5D2E70E8"/>
     <w:multiLevelType w:val="hybridMultilevel"/>
     <w:tmpl w:val="A5CC2428"/>
@@ -464,7 +840,179 @@
       </w:pPr>
     </w:lvl>
   </w:abstractNum>
-  <w:abstractNum w:abstractNumId="2" w15:restartNumberingAfterBreak="0">
+  <w:abstractNum w:abstractNumId="3" w15:restartNumberingAfterBreak="0">
+    <w:nsid w:val="5F602096"/>
+    <w:multiLevelType w:val="hybridMultilevel"/>
+    <w:tmpl w:val="8684067C"/>
+    <w:lvl w:ilvl="0" w:tplc="0C00000F">
+      <w:start w:val="1"/>
+      <w:numFmt w:val="decimal"/>
+      <w:lvlText w:val="%1."/>
+      <w:lvlJc w:val="left"/>
+      <w:pPr>
+        <w:ind w:left="720" w:hanging="360"/>
+      </w:pPr>
+    </w:lvl>
+    <w:lvl w:ilvl="1" w:tplc="0C000019" w:tentative="1">
+      <w:start w:val="1"/>
+      <w:numFmt w:val="lowerLetter"/>
+      <w:lvlText w:val="%2."/>
+      <w:lvlJc w:val="left"/>
+      <w:pPr>
+        <w:ind w:left="1440" w:hanging="360"/>
+      </w:pPr>
+    </w:lvl>
+    <w:lvl w:ilvl="2" w:tplc="0C00001B" w:tentative="1">
+      <w:start w:val="1"/>
+      <w:numFmt w:val="lowerRoman"/>
+      <w:lvlText w:val="%3."/>
+      <w:lvlJc w:val="right"/>
+      <w:pPr>
+        <w:ind w:left="2160" w:hanging="180"/>
+      </w:pPr>
+    </w:lvl>
+    <w:lvl w:ilvl="3" w:tplc="0C00000F" w:tentative="1">
+      <w:start w:val="1"/>
+      <w:numFmt w:val="decimal"/>
+      <w:lvlText w:val="%4."/>
+      <w:lvlJc w:val="left"/>
+      <w:pPr>
+        <w:ind w:left="2880" w:hanging="360"/>
+      </w:pPr>
+    </w:lvl>
+    <w:lvl w:ilvl="4" w:tplc="0C000019" w:tentative="1">
+      <w:start w:val="1"/>
+      <w:numFmt w:val="lowerLetter"/>
+      <w:lvlText w:val="%5."/>
+      <w:lvlJc w:val="left"/>
+      <w:pPr>
+        <w:ind w:left="3600" w:hanging="360"/>
+      </w:pPr>
+    </w:lvl>
+    <w:lvl w:ilvl="5" w:tplc="0C00001B" w:tentative="1">
+      <w:start w:val="1"/>
+      <w:numFmt w:val="lowerRoman"/>
+      <w:lvlText w:val="%6."/>
+      <w:lvlJc w:val="right"/>
+      <w:pPr>
+        <w:ind w:left="4320" w:hanging="180"/>
+      </w:pPr>
+    </w:lvl>
+    <w:lvl w:ilvl="6" w:tplc="0C00000F" w:tentative="1">
+      <w:start w:val="1"/>
+      <w:numFmt w:val="decimal"/>
+      <w:lvlText w:val="%7."/>
+      <w:lvlJc w:val="left"/>
+      <w:pPr>
+        <w:ind w:left="5040" w:hanging="360"/>
+      </w:pPr>
+    </w:lvl>
+    <w:lvl w:ilvl="7" w:tplc="0C000019" w:tentative="1">
+      <w:start w:val="1"/>
+      <w:numFmt w:val="lowerLetter"/>
+      <w:lvlText w:val="%8."/>
+      <w:lvlJc w:val="left"/>
+      <w:pPr>
+        <w:ind w:left="5760" w:hanging="360"/>
+      </w:pPr>
+    </w:lvl>
+    <w:lvl w:ilvl="8" w:tplc="0C00001B" w:tentative="1">
+      <w:start w:val="1"/>
+      <w:numFmt w:val="lowerRoman"/>
+      <w:lvlText w:val="%9."/>
+      <w:lvlJc w:val="right"/>
+      <w:pPr>
+        <w:ind w:left="6480" w:hanging="180"/>
+      </w:pPr>
+    </w:lvl>
+  </w:abstractNum>
+  <w:abstractNum w:abstractNumId="4" w15:restartNumberingAfterBreak="0">
+    <w:nsid w:val="63876D90"/>
+    <w:multiLevelType w:val="hybridMultilevel"/>
+    <w:tmpl w:val="F07C6D1E"/>
+    <w:lvl w:ilvl="0" w:tplc="0C00000F">
+      <w:start w:val="1"/>
+      <w:numFmt w:val="decimal"/>
+      <w:lvlText w:val="%1."/>
+      <w:lvlJc w:val="left"/>
+      <w:pPr>
+        <w:ind w:left="720" w:hanging="360"/>
+      </w:pPr>
+    </w:lvl>
+    <w:lvl w:ilvl="1" w:tplc="0C000019" w:tentative="1">
+      <w:start w:val="1"/>
+      <w:numFmt w:val="lowerLetter"/>
+      <w:lvlText w:val="%2."/>
+      <w:lvlJc w:val="left"/>
+      <w:pPr>
+        <w:ind w:left="1440" w:hanging="360"/>
+      </w:pPr>
+    </w:lvl>
+    <w:lvl w:ilvl="2" w:tplc="0C00001B" w:tentative="1">
+      <w:start w:val="1"/>
+      <w:numFmt w:val="lowerRoman"/>
+      <w:lvlText w:val="%3."/>
+      <w:lvlJc w:val="right"/>
+      <w:pPr>
+        <w:ind w:left="2160" w:hanging="180"/>
+      </w:pPr>
+    </w:lvl>
+    <w:lvl w:ilvl="3" w:tplc="0C00000F" w:tentative="1">
+      <w:start w:val="1"/>
+      <w:numFmt w:val="decimal"/>
+      <w:lvlText w:val="%4."/>
+      <w:lvlJc w:val="left"/>
+      <w:pPr>
+        <w:ind w:left="2880" w:hanging="360"/>
+      </w:pPr>
+    </w:lvl>
+    <w:lvl w:ilvl="4" w:tplc="0C000019" w:tentative="1">
+      <w:start w:val="1"/>
+      <w:numFmt w:val="lowerLetter"/>
+      <w:lvlText w:val="%5."/>
+      <w:lvlJc w:val="left"/>
+      <w:pPr>
+        <w:ind w:left="3600" w:hanging="360"/>
+      </w:pPr>
+    </w:lvl>
+    <w:lvl w:ilvl="5" w:tplc="0C00001B" w:tentative="1">
+      <w:start w:val="1"/>
+      <w:numFmt w:val="lowerRoman"/>
+      <w:lvlText w:val="%6."/>
+      <w:lvlJc w:val="right"/>
+      <w:pPr>
+        <w:ind w:left="4320" w:hanging="180"/>
+      </w:pPr>
+    </w:lvl>
+    <w:lvl w:ilvl="6" w:tplc="0C00000F" w:tentative="1">
+      <w:start w:val="1"/>
+      <w:numFmt w:val="decimal"/>
+      <w:lvlText w:val="%7."/>
+      <w:lvlJc w:val="left"/>
+      <w:pPr>
+        <w:ind w:left="5040" w:hanging="360"/>
+      </w:pPr>
+    </w:lvl>
+    <w:lvl w:ilvl="7" w:tplc="0C000019" w:tentative="1">
+      <w:start w:val="1"/>
+      <w:numFmt w:val="lowerLetter"/>
+      <w:lvlText w:val="%8."/>
+      <w:lvlJc w:val="left"/>
+      <w:pPr>
+        <w:ind w:left="5760" w:hanging="360"/>
+      </w:pPr>
+    </w:lvl>
+    <w:lvl w:ilvl="8" w:tplc="0C00001B" w:tentative="1">
+      <w:start w:val="1"/>
+      <w:numFmt w:val="lowerRoman"/>
+      <w:lvlText w:val="%9."/>
+      <w:lvlJc w:val="right"/>
+      <w:pPr>
+        <w:ind w:left="6480" w:hanging="180"/>
+      </w:pPr>
+    </w:lvl>
+  </w:abstractNum>
+  <w:abstractNum w:abstractNumId="5" w15:restartNumberingAfterBreak="0">
     <w:nsid w:val="7A1131BD"/>
     <w:multiLevelType w:val="hybridMultilevel"/>
     <w:tmpl w:val="AA88C84A"/>
@@ -551,13 +1099,22 @@
     </w:lvl>
   </w:abstractNum>
   <w:num w:numId="1" w16cid:durableId="806170549">
-    <w:abstractNumId w:val="2"/>
+    <w:abstractNumId w:val="5"/>
   </w:num>
   <w:num w:numId="2" w16cid:durableId="1296333094">
     <w:abstractNumId w:val="0"/>
   </w:num>
   <w:num w:numId="3" w16cid:durableId="1455514145">
+    <w:abstractNumId w:val="2"/>
+  </w:num>
+  <w:num w:numId="4" w16cid:durableId="620500501">
+    <w:abstractNumId w:val="3"/>
+  </w:num>
+  <w:num w:numId="5" w16cid:durableId="2063094720">
     <w:abstractNumId w:val="1"/>
+  </w:num>
+  <w:num w:numId="6" w16cid:durableId="717897283">
+    <w:abstractNumId w:val="4"/>
   </w:num>
 </w:numbering>
 </file>

</xml_diff>